<commit_message>
Resolve funding declaration and redact repo URL for double-blind review
</commit_message>
<xml_diff>
--- a/paper/ijacsa/Beyond_Big_O_IJACSA_Ready.docx
+++ b/paper/ijacsa/Beyond_Big_O_IJACSA_Ready.docx
@@ -2810,7 +2810,7 @@
         <w:pStyle w:val="BodyText"/>
       </w:pPr>
       <w:r>
-        <w:t>This work received no dedicated external funding. [Add any acknowledgments of individuals, institutions, or resources here, or state “Not applicable” if none.]</w:t>
+        <w:t>[Add any acknowledgments of individuals, institutions, or resources here, or state “Not applicable” if none.]</w:t>
       </w:r>
     </w:p>
     <w:p>
@@ -2846,7 +2846,7 @@
         <w:t xml:space="preserve">Funding: </w:t>
       </w:r>
       <w:r>
-        <w:t>[Confirm and state, e.g., “This research received no external funding.”]</w:t>
+        <w:t>This research received no external funding.</w:t>
       </w:r>
     </w:p>
     <w:p>
@@ -2860,7 +2860,7 @@
         <w:t xml:space="preserve">Data and Code Availability: </w:t>
       </w:r>
       <w:r>
-        <w:t>The repository contains the dataset generator, Python and C++ implementations, Java source, validation tests, execution configuration, raw CSV records and analysis scripts. The raw combined CSV contains 240 records (SHA-256: c86df6732b7e5e78e7a71d6b72ae65535b648b10ccb4c39255a4652018ed3dff); the supplementary construct-validity check adds 40 further records (SHA-256: ccffc4c004456ee9474ce36489e7bb7c6dacb9bb2b3dfb96ba6e0108c1965bf8). Repository: https://github.com/maheshchudaman/beyond-big-o-research (Zenodo concept DOI: 10.5281/zenodo.22089928).</w:t>
+        <w:t>The repository contains the dataset generator, Python and C++ implementations, Java source, validation tests, execution configuration, raw CSV records and analysis scripts. The raw combined CSV contains 240 records (SHA-256: c86df6732b7e5e78e7a71d6b72ae65535b648b10ccb4c39255a4652018ed3dff); the supplementary construct-validity check adds 40 further records (SHA-256: ccffc4c004456ee9474ce36489e7bb7c6dacb9bb2b3dfb96ba6e0108c1965bf8). Repository URL and Zenodo DOI are withheld for double-blind review and will be provided upon acceptance.</w:t>
       </w:r>
     </w:p>
     <w:p>

</xml_diff>

<commit_message>
Add real author details to IJACSA-ready manuscript
Mahesh Patil (corresponding) and Varun Patil, both at Shah & Anchor
Kutchhi Engineering College, Mumbai. Resolves the last placeholder
(Acknowledgment -> Not applicable) -- no bracketed fields remain.
</commit_message>
<xml_diff>
--- a/paper/ijacsa/Beyond_Big_O_IJACSA_Ready.docx
+++ b/paper/ijacsa/Beyond_Big_O_IJACSA_Ready.docx
@@ -25,7 +25,7 @@
         <w:pStyle w:val="Author"/>
       </w:pPr>
       <w:r>
-        <w:t>Mahesh Patil¹*, [Second Author Name]²</w:t>
+        <w:t>Mahesh Patil¹*, Varun Patil¹</w:t>
       </w:r>
     </w:p>
     <w:p>
@@ -33,15 +33,7 @@
         <w:pStyle w:val="Affiliation"/>
       </w:pPr>
       <w:r>
-        <w:t>[Department / Faculty Name], [University or Organization Name], [City], [Country]¹</w:t>
-      </w:r>
-    </w:p>
-    <w:p>
-      <w:pPr>
-        <w:pStyle w:val="Affiliation"/>
-      </w:pPr>
-      <w:r>
-        <w:t>[Department / Faculty Name], [University or Organization Name], [City], [Country]²</w:t>
+        <w:t>Shah &amp; Anchor Kutchhi Engineering College, Mumbai, Maharashtra, India¹</w:t>
       </w:r>
     </w:p>
     <w:p>
@@ -49,7 +41,7 @@
         <w:pStyle w:val="sponsors"/>
       </w:pPr>
       <w:r>
-        <w:t>* Corresponding author ([corresponding.author@yourinstitution.edu])</w:t>
+        <w:t>* Corresponding author (mahesh.patil@sakec.ac.in)</w:t>
       </w:r>
     </w:p>
     <w:p>
@@ -2810,7 +2802,7 @@
         <w:pStyle w:val="BodyText"/>
       </w:pPr>
       <w:r>
-        <w:t>[Add any acknowledgments of individuals, institutions, or resources here, or state “Not applicable” if none.]</w:t>
+        <w:t>Not applicable.</w:t>
       </w:r>
     </w:p>
     <w:p>

</xml_diff>

<commit_message>
List Varun Patil as author 2 with his own affiliation number
</commit_message>
<xml_diff>
--- a/paper/ijacsa/Beyond_Big_O_IJACSA_Ready.docx
+++ b/paper/ijacsa/Beyond_Big_O_IJACSA_Ready.docx
@@ -25,7 +25,7 @@
         <w:pStyle w:val="Author"/>
       </w:pPr>
       <w:r>
-        <w:t>Mahesh Patil¹*, Varun Patil¹</w:t>
+        <w:t>Mahesh Patil¹*, Varun Patil²</w:t>
       </w:r>
     </w:p>
     <w:p>
@@ -34,6 +34,14 @@
       </w:pPr>
       <w:r>
         <w:t>Shah &amp; Anchor Kutchhi Engineering College, Mumbai, Maharashtra, India¹</w:t>
+      </w:r>
+    </w:p>
+    <w:p>
+      <w:pPr>
+        <w:pStyle w:val="Affiliation"/>
+      </w:pPr>
+      <w:r>
+        <w:t>Shah &amp; Anchor Kutchhi Engineering College, Mumbai, Maharashtra, India²</w:t>
       </w:r>
     </w:p>
     <w:p>

</xml_diff>

<commit_message>
Fix author-block alignment bug in real Word
The template's "sponsors" style carries a floating w:framePr (wrap="auto")
plus a top border, inherited from its original use as a fixed sponsor-logo
box. Reusing that style for the corresponding-author line detached it
from normal flow and pushed the Author/Affiliation centering off to the
right in real MS Word (LibreOffice rendered it fine, masking the bug).
Replaced with a plain centered paragraph -- no more floating frame.
</commit_message>
<xml_diff>
--- a/paper/ijacsa/Beyond_Big_O_IJACSA_Ready.docx
+++ b/paper/ijacsa/Beyond_Big_O_IJACSA_Ready.docx
@@ -46,9 +46,13 @@
     </w:p>
     <w:p>
       <w:pPr>
-        <w:pStyle w:val="sponsors"/>
-      </w:pPr>
-      <w:r>
+        <w:jc w:val="center"/>
+      </w:pPr>
+      <w:r>
+        <w:rPr>
+          <w:i/>
+          <w:sz w:val="16"/>
+        </w:rPr>
         <w:t>* Corresponding author (mahesh.patil@sakec.ac.in)</w:t>
       </w:r>
     </w:p>

</xml_diff>